<commit_message>
-Added README -Updated metadata .jsons following initial commit -Updated output .docx and retained for each example
</commit_message>
<xml_diff>
--- a/report/draft/template-draft.docx
+++ b/report/draft/template-draft.docx
@@ -3014,7 +3014,7 @@
           <w:rFonts w:ascii="Arial Narrow"/>
           <w:sz w:val="20"/>
         </w:rPr>
-        <w:t>[Source: /cluster-data/user-homes/jacob/projects_internal/reportifyr_examples/scripts/01_analysis/analysis.R COULD NOT ACCESS GIT]</w:t>
+        <w:t>[Source: /cluster-data/user-homes/jacob/projects_internal/reportifyr_examples/scripts/01_analysis/analysis.R 2025-01-08 18:30:22]</w:t>
       </w:r>
       <w:r>
         <w:br/>
@@ -3133,7 +3133,7 @@
           <w:rFonts w:ascii="Arial Narrow"/>
           <w:sz w:val="20"/>
         </w:rPr>
-        <w:t>[Source: /cluster-data/user-homes/jacob/projects_internal/reportifyr_examples/scripts/01_analysis/analysis.R COULD NOT ACCESS GIT]</w:t>
+        <w:t>[Source: /cluster-data/user-homes/jacob/projects_internal/reportifyr_examples/scripts/01_analysis/analysis.R 2025-01-08 18:30:22]</w:t>
       </w:r>
       <w:r>
         <w:br/>

</xml_diff>

<commit_message>
-Added README -Updated metadata .jsons following initial commit (removal of "COULD NOT ACCESS GIT") -Updated output .docx and retained per example
</commit_message>
<xml_diff>
--- a/report/draft/template-draft.docx
+++ b/report/draft/template-draft.docx
@@ -3014,7 +3014,7 @@
           <w:rFonts w:ascii="Arial Narrow"/>
           <w:sz w:val="20"/>
         </w:rPr>
-        <w:t>[Source: /cluster-data/user-homes/jacob/projects_internal/reportifyr_examples/scripts/01_analysis/analysis.R COULD NOT ACCESS GIT]</w:t>
+        <w:t>[Source: /cluster-data/user-homes/jacob/projects_internal/reportifyr_examples/scripts/01_analysis/analysis.R 2025-01-08 18:30:22]</w:t>
       </w:r>
       <w:r>
         <w:br/>
@@ -3133,7 +3133,7 @@
           <w:rFonts w:ascii="Arial Narrow"/>
           <w:sz w:val="20"/>
         </w:rPr>
-        <w:t>[Source: /cluster-data/user-homes/jacob/projects_internal/reportifyr_examples/scripts/01_analysis/analysis.R COULD NOT ACCESS GIT]</w:t>
+        <w:t>[Source: /cluster-data/user-homes/jacob/projects_internal/reportifyr_examples/scripts/01_analysis/analysis.R 2025-01-08 18:30:22]</w:t>
       </w:r>
       <w:r>
         <w:br/>

</xml_diff>